<commit_message>
Resume template: separate earlier roles, larger type, general resume
- AKC and OnPoint get their own title/date lines instead of one merged
  "Additional Experience" bullet (titles are what recruiters scan first).
- Body text 9.5pt -> 10pt with headings scaled to match; up to two pages.
- npm run resume -- --general builds a non-job-specific resume from
  content/resume.json's "general" block; --all now includes it.
- OpenArt resume: summary says 6 years (matches the Oct 2020 start) and
  drops PodFlow to stay on one page.

Co-Authored-By: Claude Opus 5.5 <noreply@anthropic.com>
</commit_message>
<xml_diff>
--- a/resumes/openart-growth-data-engineer-bb1c.docx
+++ b/resumes/openart-growth-data-engineer-bb1c.docx
@@ -12,8 +12,8 @@
           <w:b/>
           <w:bCs/>
           <w:color w:val="2C3E50"/>
-          <w:sz w:val="34"/>
-          <w:szCs w:val="34"/>
+          <w:sz w:val="36"/>
+          <w:szCs w:val="36"/>
         </w:rPr>
         <w:t xml:space="preserve">CHRISTOPHER NEALE</w:t>
       </w:r>
@@ -29,8 +29,8 @@
           <w:b/>
           <w:bCs/>
           <w:color w:val="2C3E50"/>
-          <w:sz w:val="22"/>
-          <w:szCs w:val="22"/>
+          <w:sz w:val="23"/>
+          <w:szCs w:val="23"/>
         </w:rPr>
         <w:t xml:space="preserve">Marketing Data &amp; Growth Analytics</w:t>
       </w:r>
@@ -38,86 +38,6 @@
     <w:p>
       <w:pPr>
         <w:jc w:val="center"/>
-      </w:pPr>
-      <w:r>
-        <w:rPr>
-          <w:rFonts w:ascii="Calibri" w:cs="Calibri" w:eastAsia="Calibri" w:hAnsi="Calibri"/>
-          <w:sz w:val="18"/>
-          <w:szCs w:val="18"/>
-        </w:rPr>
-        <w:t xml:space="preserve">Raleigh, NC  |  </w:t>
-      </w:r>
-      <w:r>
-        <w:rPr>
-          <w:rFonts w:ascii="Calibri" w:cs="Calibri" w:eastAsia="Calibri" w:hAnsi="Calibri"/>
-          <w:sz w:val="18"/>
-          <w:szCs w:val="18"/>
-        </w:rPr>
-        <w:t xml:space="preserve">984-382-3980  |  </w:t>
-      </w:r>
-      <w:r>
-        <w:rPr>
-          <w:rFonts w:ascii="Calibri" w:cs="Calibri" w:eastAsia="Calibri" w:hAnsi="Calibri"/>
-          <w:sz w:val="18"/>
-          <w:szCs w:val="18"/>
-        </w:rPr>
-        <w:t xml:space="preserve">cjneale.analyst@gmail.com  |  </w:t>
-      </w:r>
-      <w:hyperlink w:history="1" r:id="rIdo_6rumwhomu0mpqn0vmy7">
-        <w:r>
-          <w:rPr>
-            <w:rFonts w:ascii="Calibri" w:cs="Calibri" w:eastAsia="Calibri" w:hAnsi="Calibri"/>
-            <w:color w:val="1F5FAD"/>
-            <w:sz w:val="18"/>
-            <w:szCs w:val="18"/>
-            <w:u w:val="single"/>
-          </w:rPr>
-          <w:t xml:space="preserve">linkedin.com/in/christophernealeanalyst</w:t>
-        </w:r>
-      </w:hyperlink>
-      <w:r>
-        <w:rPr>
-          <w:rFonts w:ascii="Calibri" w:cs="Calibri" w:eastAsia="Calibri" w:hAnsi="Calibri"/>
-          <w:sz w:val="18"/>
-          <w:szCs w:val="18"/>
-        </w:rPr>
-        <w:t xml:space="preserve">  |  </w:t>
-      </w:r>
-      <w:hyperlink w:history="1" r:id="rIdfewpl8r3me6hjoddq5xul">
-        <w:r>
-          <w:rPr>
-            <w:rFonts w:ascii="Calibri" w:cs="Calibri" w:eastAsia="Calibri" w:hAnsi="Calibri"/>
-            <w:color w:val="1F5FAD"/>
-            <w:sz w:val="18"/>
-            <w:szCs w:val="18"/>
-            <w:u w:val="single"/>
-          </w:rPr>
-          <w:t xml:space="preserve">cjportfolio-inky.vercel.app</w:t>
-        </w:r>
-      </w:hyperlink>
-    </w:p>
-    <w:p>
-      <w:pPr>
-        <w:pBdr>
-          <w:bottom w:val="single" w:color="2C3E50" w:sz="6" w:space="1"/>
-        </w:pBdr>
-        <w:spacing w:after="60" w:before="140"/>
-      </w:pPr>
-      <w:r>
-        <w:rPr>
-          <w:rFonts w:ascii="Calibri" w:cs="Calibri" w:eastAsia="Calibri" w:hAnsi="Calibri"/>
-          <w:b/>
-          <w:bCs/>
-          <w:color w:val="2C3E50"/>
-          <w:sz w:val="21"/>
-          <w:szCs w:val="21"/>
-        </w:rPr>
-        <w:t xml:space="preserve">SUMMARY</w:t>
-      </w:r>
-    </w:p>
-    <w:p>
-      <w:pPr>
-        <w:spacing w:after="20"/>
       </w:pPr>
       <w:r>
         <w:rPr>
@@ -125,41 +45,15 @@
           <w:sz w:val="19"/>
           <w:szCs w:val="19"/>
         </w:rPr>
-        <w:t xml:space="preserve">Marketing data practitioner with 5 years building conversion tracking, attribution, CRM data, and experimentation systems for consumer and high-value-customer businesses, most recently as Senior Manager, Marketing Insights &amp; CRM Analytics at flyExclusive. Owns the conversion plumbing end to end: Google Tag Manager, Meta Pixel and CAPI, Google Ads conversion tracking, and offline conversion uploads from the CRM. Builds the pipelines in SQL and Python; M.S. in Data Science with hands-on applied-AI experience.</w:t>
-      </w:r>
-    </w:p>
-    <w:p>
-      <w:pPr>
-        <w:pBdr>
-          <w:bottom w:val="single" w:color="2C3E50" w:sz="6" w:space="1"/>
-        </w:pBdr>
-        <w:spacing w:after="60" w:before="140"/>
-      </w:pPr>
-      <w:r>
-        <w:rPr>
-          <w:rFonts w:ascii="Calibri" w:cs="Calibri" w:eastAsia="Calibri" w:hAnsi="Calibri"/>
-          <w:b/>
-          <w:bCs/>
-          <w:color w:val="2C3E50"/>
-          <w:sz w:val="21"/>
-          <w:szCs w:val="21"/>
-        </w:rPr>
-        <w:t xml:space="preserve">TECHNICAL EXPERTISE</w:t>
-      </w:r>
-    </w:p>
-    <w:p>
-      <w:pPr>
-        <w:spacing w:after="30"/>
-      </w:pPr>
-      <w:r>
-        <w:rPr>
-          <w:rFonts w:ascii="Calibri" w:cs="Calibri" w:eastAsia="Calibri" w:hAnsi="Calibri"/>
-          <w:b/>
-          <w:bCs/>
+        <w:t xml:space="preserve">Raleigh, NC  |  </w:t>
+      </w:r>
+      <w:r>
+        <w:rPr>
+          <w:rFonts w:ascii="Calibri" w:cs="Calibri" w:eastAsia="Calibri" w:hAnsi="Calibri"/>
           <w:sz w:val="19"/>
           <w:szCs w:val="19"/>
         </w:rPr>
-        <w:t xml:space="preserve">Growth &amp; Measurement: </w:t>
+        <w:t xml:space="preserve">984-382-3980  |  </w:t>
       </w:r>
       <w:r>
         <w:rPr>
@@ -167,407 +61,9 @@
           <w:sz w:val="19"/>
           <w:szCs w:val="19"/>
         </w:rPr>
-        <w:t xml:space="preserve">Google Tag Manager, Meta Pixel and Conversions API, Google Ads conversion tracking, offline conversion uploads, multi-touch attribution, UTM and click-ID tracking, event taxonomy design, consent/GPC handling, A/B testing, GA4</w:t>
-      </w:r>
-    </w:p>
-    <w:p>
-      <w:pPr>
-        <w:spacing w:after="30"/>
-      </w:pPr>
-      <w:r>
-        <w:rPr>
-          <w:rFonts w:ascii="Calibri" w:cs="Calibri" w:eastAsia="Calibri" w:hAnsi="Calibri"/>
-          <w:b/>
-          <w:bCs/>
-          <w:sz w:val="19"/>
-          <w:szCs w:val="19"/>
-        </w:rPr>
-        <w:t xml:space="preserve">Data &amp; Engineering: </w:t>
-      </w:r>
-      <w:r>
-        <w:rPr>
-          <w:rFonts w:ascii="Calibri" w:cs="Calibri" w:eastAsia="Calibri" w:hAnsi="Calibri"/>
-          <w:sz w:val="19"/>
-          <w:szCs w:val="19"/>
-        </w:rPr>
-        <w:t xml:space="preserve">SQL (window functions), Python, Postgres, Databricks, REST APIs, data pipelines, CRM/CDP architecture, Master Data Management, HubSpot, Iterable</w:t>
-      </w:r>
-    </w:p>
-    <w:p>
-      <w:pPr>
-        <w:spacing w:after="30"/>
-      </w:pPr>
-      <w:r>
-        <w:rPr>
-          <w:rFonts w:ascii="Calibri" w:cs="Calibri" w:eastAsia="Calibri" w:hAnsi="Calibri"/>
-          <w:b/>
-          <w:bCs/>
-          <w:sz w:val="19"/>
-          <w:szCs w:val="19"/>
-        </w:rPr>
-        <w:t xml:space="preserve">Analytics &amp; AI: </w:t>
-      </w:r>
-      <w:r>
-        <w:rPr>
-          <w:rFonts w:ascii="Calibri" w:cs="Calibri" w:eastAsia="Calibri" w:hAnsi="Calibri"/>
-          <w:sz w:val="19"/>
-          <w:szCs w:val="19"/>
-        </w:rPr>
-        <w:t xml:space="preserve">Tableau, Power BI, LLM pipelines, scikit-learn, XGBoost, AI-assisted development (Claude Code)</w:t>
-      </w:r>
-    </w:p>
-    <w:p>
-      <w:pPr>
-        <w:pBdr>
-          <w:bottom w:val="single" w:color="2C3E50" w:sz="6" w:space="1"/>
-        </w:pBdr>
-        <w:spacing w:after="60" w:before="140"/>
-      </w:pPr>
-      <w:r>
-        <w:rPr>
-          <w:rFonts w:ascii="Calibri" w:cs="Calibri" w:eastAsia="Calibri" w:hAnsi="Calibri"/>
-          <w:b/>
-          <w:bCs/>
-          <w:color w:val="2C3E50"/>
-          <w:sz w:val="21"/>
-          <w:szCs w:val="21"/>
-        </w:rPr>
-        <w:t xml:space="preserve">PROFESSIONAL EXPERIENCE</w:t>
-      </w:r>
-    </w:p>
-    <w:p>
-      <w:pPr>
-        <w:tabs>
-          <w:tab w:val="right" w:pos="10800"/>
-        </w:tabs>
-        <w:spacing w:after="30" w:before="80"/>
-      </w:pPr>
-      <w:r>
-        <w:rPr>
-          <w:rFonts w:ascii="Calibri" w:cs="Calibri" w:eastAsia="Calibri" w:hAnsi="Calibri"/>
-          <w:b/>
-          <w:bCs/>
-          <w:sz w:val="20"/>
-          <w:szCs w:val="20"/>
-        </w:rPr>
-        <w:t xml:space="preserve">flyExclusive, Raleigh, NC</w:t>
-      </w:r>
-      <w:r>
-        <w:rPr>
-          <w:rFonts w:ascii="Calibri" w:cs="Calibri" w:eastAsia="Calibri" w:hAnsi="Calibri"/>
-          <w:i/>
-          <w:iCs/>
-          <w:color w:val="2C3E50"/>
-          <w:sz w:val="20"/>
-          <w:szCs w:val="20"/>
-        </w:rPr>
-        <w:t xml:space="preserve">   Senior Manager, Marketing Insights &amp; CRM Analytics</w:t>
-      </w:r>
-      <w:r>
-        <w:rPr>
-          <w:rFonts w:ascii="Calibri" w:cs="Calibri" w:eastAsia="Calibri" w:hAnsi="Calibri"/>
-          <w:i/>
-          <w:iCs/>
-          <w:color w:val="2C3E50"/>
-          <w:sz w:val="20"/>
-          <w:szCs w:val="20"/>
-        </w:rPr>
-        <w:t xml:space="preserve">	Nov 2025 – Present</w:t>
-      </w:r>
-    </w:p>
-    <w:p>
-      <w:pPr>
-        <w:pStyle w:val="ListParagraph"/>
-        <w:numPr>
-          <w:ilvl w:val="0"/>
-          <w:numId w:val="2"/>
-        </w:numPr>
-        <w:spacing w:after="30"/>
-      </w:pPr>
-      <w:r>
-        <w:rPr>
-          <w:rFonts w:ascii="Calibri" w:cs="Calibri" w:eastAsia="Calibri" w:hAnsi="Calibri"/>
-          <w:sz w:val="19"/>
-          <w:szCs w:val="19"/>
-        </w:rPr>
-        <w:t xml:space="preserve">Implemented conversion tracking for the new company website: Google Tag Manager, Meta Pixel and Conversions API, and Google Ads conversion tracking.</w:t>
-      </w:r>
-    </w:p>
-    <w:p>
-      <w:pPr>
-        <w:pStyle w:val="ListParagraph"/>
-        <w:numPr>
-          <w:ilvl w:val="0"/>
-          <w:numId w:val="2"/>
-        </w:numPr>
-        <w:spacing w:after="30"/>
-      </w:pPr>
-      <w:r>
-        <w:rPr>
-          <w:rFonts w:ascii="Calibri" w:cs="Calibri" w:eastAsia="Calibri" w:hAnsi="Calibri"/>
-          <w:sz w:val="19"/>
-          <w:szCs w:val="19"/>
-        </w:rPr>
-        <w:t xml:space="preserve">Set up offline conversion uploads that send downstream CRM outcomes back to ad platforms, so campaigns optimize on qualified leads and sales instead of form fills.</w:t>
-      </w:r>
-    </w:p>
-    <w:p>
-      <w:pPr>
-        <w:pStyle w:val="ListParagraph"/>
-        <w:numPr>
-          <w:ilvl w:val="0"/>
-          <w:numId w:val="2"/>
-        </w:numPr>
-        <w:spacing w:after="30"/>
-      </w:pPr>
-      <w:r>
-        <w:rPr>
-          <w:rFonts w:ascii="Calibri" w:cs="Calibri" w:eastAsia="Calibri" w:hAnsi="Calibri"/>
-          <w:sz w:val="19"/>
-          <w:szCs w:val="19"/>
-        </w:rPr>
-        <w:t xml:space="preserve">Redesigned the performance dashboards and attribution framework connecting marketing activity to acquisition, retention, and high-value segments.</w:t>
-      </w:r>
-    </w:p>
-    <w:p>
-      <w:pPr>
-        <w:pStyle w:val="ListParagraph"/>
-        <w:numPr>
-          <w:ilvl w:val="0"/>
-          <w:numId w:val="2"/>
-        </w:numPr>
-        <w:spacing w:after="30"/>
-      </w:pPr>
-      <w:r>
-        <w:rPr>
-          <w:rFonts w:ascii="Calibri" w:cs="Calibri" w:eastAsia="Calibri" w:hAnsi="Calibri"/>
-          <w:sz w:val="19"/>
-          <w:szCs w:val="19"/>
-        </w:rPr>
-        <w:t xml:space="preserve">Led a CRM systems transformation: HubSpot governance, scalable data architecture, deduplication workflows, and Master Data Management.</w:t>
-      </w:r>
-    </w:p>
-    <w:p>
-      <w:pPr>
-        <w:pStyle w:val="ListParagraph"/>
-        <w:numPr>
-          <w:ilvl w:val="0"/>
-          <w:numId w:val="2"/>
-        </w:numPr>
-        <w:spacing w:after="30"/>
-      </w:pPr>
-      <w:r>
-        <w:rPr>
-          <w:rFonts w:ascii="Calibri" w:cs="Calibri" w:eastAsia="Calibri" w:hAnsi="Calibri"/>
-          <w:sz w:val="19"/>
-          <w:szCs w:val="19"/>
-        </w:rPr>
-        <w:t xml:space="preserve">Built an autonomous enrichment pipeline connecting LLM APIs to the CRM database, powering a lead-scoring model that prioritizes high-value accounts.</w:t>
-      </w:r>
-    </w:p>
-    <w:p>
-      <w:pPr>
-        <w:tabs>
-          <w:tab w:val="right" w:pos="10800"/>
-        </w:tabs>
-        <w:spacing w:after="30" w:before="80"/>
-      </w:pPr>
-      <w:r>
-        <w:rPr>
-          <w:rFonts w:ascii="Calibri" w:cs="Calibri" w:eastAsia="Calibri" w:hAnsi="Calibri"/>
-          <w:b/>
-          <w:bCs/>
-          <w:sz w:val="20"/>
-          <w:szCs w:val="20"/>
-        </w:rPr>
-        <w:t xml:space="preserve">TRANZACT, Raleigh, NC</w:t>
-      </w:r>
-      <w:r>
-        <w:rPr>
-          <w:rFonts w:ascii="Calibri" w:cs="Calibri" w:eastAsia="Calibri" w:hAnsi="Calibri"/>
-          <w:i/>
-          <w:iCs/>
-          <w:color w:val="2C3E50"/>
-          <w:sz w:val="20"/>
-          <w:szCs w:val="20"/>
-        </w:rPr>
-        <w:t xml:space="preserve">   Sr. Data Analyst, CRM</w:t>
-      </w:r>
-      <w:r>
-        <w:rPr>
-          <w:rFonts w:ascii="Calibri" w:cs="Calibri" w:eastAsia="Calibri" w:hAnsi="Calibri"/>
-          <w:i/>
-          <w:iCs/>
-          <w:color w:val="2C3E50"/>
-          <w:sz w:val="20"/>
-          <w:szCs w:val="20"/>
-        </w:rPr>
-        <w:t xml:space="preserve">	May 2022 – Nov 2025</w:t>
-      </w:r>
-    </w:p>
-    <w:p>
-      <w:pPr>
-        <w:pStyle w:val="ListParagraph"/>
-        <w:numPr>
-          <w:ilvl w:val="0"/>
-          <w:numId w:val="2"/>
-        </w:numPr>
-        <w:spacing w:after="30"/>
-      </w:pPr>
-      <w:r>
-        <w:rPr>
-          <w:rFonts w:ascii="Calibri" w:cs="Calibri" w:eastAsia="Calibri" w:hAnsi="Calibri"/>
-          <w:sz w:val="19"/>
-          <w:szCs w:val="19"/>
-        </w:rPr>
-        <w:t xml:space="preserve">Ran multi-touch attribution modeling and partnered with commercial and finance leadership on attribution, sales performance, and forecasting.</w:t>
-      </w:r>
-    </w:p>
-    <w:p>
-      <w:pPr>
-        <w:pStyle w:val="ListParagraph"/>
-        <w:numPr>
-          <w:ilvl w:val="0"/>
-          <w:numId w:val="2"/>
-        </w:numPr>
-        <w:spacing w:after="30"/>
-      </w:pPr>
-      <w:r>
-        <w:rPr>
-          <w:rFonts w:ascii="Calibri" w:cs="Calibri" w:eastAsia="Calibri" w:hAnsi="Calibri"/>
-          <w:sz w:val="19"/>
-          <w:szCs w:val="19"/>
-        </w:rPr>
-        <w:t xml:space="preserve">Built CRM/ESP integrations (SQL, JSON REST APIs) syncing behavioral data into Iterable for 10+ lifecycle campaigns.</w:t>
-      </w:r>
-    </w:p>
-    <w:p>
-      <w:pPr>
-        <w:pStyle w:val="ListParagraph"/>
-        <w:numPr>
-          <w:ilvl w:val="0"/>
-          <w:numId w:val="2"/>
-        </w:numPr>
-        <w:spacing w:after="30"/>
-      </w:pPr>
-      <w:r>
-        <w:rPr>
-          <w:rFonts w:ascii="Calibri" w:cs="Calibri" w:eastAsia="Calibri" w:hAnsi="Calibri"/>
-          <w:sz w:val="19"/>
-          <w:szCs w:val="19"/>
-        </w:rPr>
-        <w:t xml:space="preserve">Ran a structured A/B testing program: 50% win rate, 30% CTR improvement.</w:t>
-      </w:r>
-    </w:p>
-    <w:p>
-      <w:pPr>
-        <w:spacing w:after="30" w:before="80"/>
-      </w:pPr>
-      <w:r>
-        <w:rPr>
-          <w:rFonts w:ascii="Calibri" w:cs="Calibri" w:eastAsia="Calibri" w:hAnsi="Calibri"/>
-          <w:b/>
-          <w:bCs/>
-          <w:sz w:val="20"/>
-          <w:szCs w:val="20"/>
-        </w:rPr>
-        <w:t xml:space="preserve">Additional Experience</w:t>
-      </w:r>
-    </w:p>
-    <w:p>
-      <w:pPr>
-        <w:pStyle w:val="ListParagraph"/>
-        <w:numPr>
-          <w:ilvl w:val="0"/>
-          <w:numId w:val="2"/>
-        </w:numPr>
-        <w:spacing w:after="30"/>
-      </w:pPr>
-      <w:r>
-        <w:rPr>
-          <w:rFonts w:ascii="Calibri" w:cs="Calibri" w:eastAsia="Calibri" w:hAnsi="Calibri"/>
-          <w:sz w:val="19"/>
-          <w:szCs w:val="19"/>
-        </w:rPr>
-        <w:t xml:space="preserve">American Kennel Club, Email Marketing Associate (Apr 2021 – May 2022): Tableau-driven audience insights and automated customer journeys. OnPoint, Marketing Manager (Oct 2020 – Apr 2021): lifecycle strategy and targeting across email and paid social, with C-suite alignment.</w:t>
-      </w:r>
-    </w:p>
-    <w:p>
-      <w:pPr>
-        <w:pBdr>
-          <w:bottom w:val="single" w:color="2C3E50" w:sz="6" w:space="1"/>
-        </w:pBdr>
-        <w:spacing w:after="60" w:before="140"/>
-      </w:pPr>
-      <w:r>
-        <w:rPr>
-          <w:rFonts w:ascii="Calibri" w:cs="Calibri" w:eastAsia="Calibri" w:hAnsi="Calibri"/>
-          <w:b/>
-          <w:bCs/>
-          <w:color w:val="2C3E50"/>
-          <w:sz w:val="21"/>
-          <w:szCs w:val="21"/>
-        </w:rPr>
-        <w:t xml:space="preserve">FEATURED PROJECTS</w:t>
-      </w:r>
-    </w:p>
-    <w:p>
-      <w:pPr>
-        <w:spacing w:after="30" w:before="60"/>
-      </w:pPr>
-      <w:r>
-        <w:rPr>
-          <w:rFonts w:ascii="Calibri" w:cs="Calibri" w:eastAsia="Calibri" w:hAnsi="Calibri"/>
-          <w:b/>
-          <w:bCs/>
-          <w:sz w:val="19"/>
-          <w:szCs w:val="19"/>
-        </w:rPr>
-        <w:t xml:space="preserve">Attribution Lab, First-Party Growth Tracking (portfolio site)</w:t>
-      </w:r>
-    </w:p>
-    <w:p>
-      <w:pPr>
-        <w:pStyle w:val="ListParagraph"/>
-        <w:numPr>
-          <w:ilvl w:val="0"/>
-          <w:numId w:val="2"/>
-        </w:numPr>
-        <w:spacing w:after="30"/>
-      </w:pPr>
-      <w:r>
-        <w:rPr>
-          <w:rFonts w:ascii="Calibri" w:cs="Calibri" w:eastAsia="Calibri" w:hAnsi="Calibri"/>
-          <w:sz w:val="19"/>
-          <w:szCs w:val="19"/>
-        </w:rPr>
-        <w:t xml:space="preserve">Built first-party tracking end to end: UTM and ad click-ID capture (gclid, gbraid, wbraid, fbclid, ttclid, li_fat_id), an event taxonomy enforced at a server-side ingestion endpoint, and event_id dedup into Postgres (Neon).</w:t>
-      </w:r>
-    </w:p>
-    <w:p>
-      <w:pPr>
-        <w:pStyle w:val="ListParagraph"/>
-        <w:numPr>
-          <w:ilvl w:val="0"/>
-          <w:numId w:val="2"/>
-        </w:numPr>
-        <w:spacing w:after="30"/>
-      </w:pPr>
-      <w:r>
-        <w:rPr>
-          <w:rFonts w:ascii="Calibri" w:cs="Calibri" w:eastAsia="Calibri" w:hAnsi="Calibri"/>
-          <w:sz w:val="19"/>
-          <w:szCs w:val="19"/>
-        </w:rPr>
-        <w:t xml:space="preserve">Wrote first-touch, last-touch, and linear attribution in SQL (window functions, 30-day lookback), data-quality checks, and consent-gated offline-conversion payloads for Google Ads, Meta CAPI, TikTok, and LinkedIn; honors Global Privacy Control.</w:t>
-      </w:r>
-    </w:p>
-    <w:p>
-      <w:pPr>
-        <w:spacing w:after="30"/>
-        <w:ind w:left="360"/>
-      </w:pPr>
-      <w:hyperlink w:history="1" w:anchor="/project/attribution" r:id="rId-2v431cwk8ix9r9asqmsk">
+        <w:t xml:space="preserve">cjneale.analyst@gmail.com  |  </w:t>
+      </w:r>
+      <w:hyperlink w:history="1" r:id="rId7uylorzmzixxfr3m_ptxp">
         <w:r>
           <w:rPr>
             <w:rFonts w:ascii="Calibri" w:cs="Calibri" w:eastAsia="Calibri" w:hAnsi="Calibri"/>
@@ -576,67 +72,18 @@
             <w:szCs w:val="19"/>
             <w:u w:val="single"/>
           </w:rPr>
-          <w:t xml:space="preserve">https://cjportfolio-inky.vercel.app/#/project/attribution</w:t>
+          <w:t xml:space="preserve">linkedin.com/in/christophernealeanalyst</w:t>
         </w:r>
       </w:hyperlink>
-    </w:p>
-    <w:p>
-      <w:pPr>
-        <w:spacing w:after="30" w:before="60"/>
-      </w:pPr>
-      <w:r>
-        <w:rPr>
-          <w:rFonts w:ascii="Calibri" w:cs="Calibri" w:eastAsia="Calibri" w:hAnsi="Calibri"/>
-          <w:b/>
-          <w:bCs/>
+      <w:r>
+        <w:rPr>
+          <w:rFonts w:ascii="Calibri" w:cs="Calibri" w:eastAsia="Calibri" w:hAnsi="Calibri"/>
           <w:sz w:val="19"/>
           <w:szCs w:val="19"/>
         </w:rPr>
-        <w:t xml:space="preserve">PodFlow, M.S. Data Science Capstone, Eastern University, 2025</w:t>
-      </w:r>
-    </w:p>
-    <w:p>
-      <w:pPr>
-        <w:pStyle w:val="ListParagraph"/>
-        <w:numPr>
-          <w:ilvl w:val="0"/>
-          <w:numId w:val="2"/>
-        </w:numPr>
-        <w:spacing w:after="30"/>
-      </w:pPr>
-      <w:r>
-        <w:rPr>
-          <w:rFonts w:ascii="Calibri" w:cs="Calibri" w:eastAsia="Calibri" w:hAnsi="Calibri"/>
-          <w:sz w:val="19"/>
-          <w:szCs w:val="19"/>
-        </w:rPr>
-        <w:t xml:space="preserve">Built a full audio-to-insight pipeline solo: transcription (faster-Whisper), automatic content segmentation via a trained CNN-BiLSTM model (benchmarked against XGBoost, focal loss for class imbalance), and LLM-based metadata enrichment, served through a REST API to a working web app.</w:t>
-      </w:r>
-    </w:p>
-    <w:p>
-      <w:pPr>
-        <w:pStyle w:val="ListParagraph"/>
-        <w:numPr>
-          <w:ilvl w:val="0"/>
-          <w:numId w:val="2"/>
-        </w:numPr>
-        <w:spacing w:after="30"/>
-      </w:pPr>
-      <w:r>
-        <w:rPr>
-          <w:rFonts w:ascii="Calibri" w:cs="Calibri" w:eastAsia="Calibri" w:hAnsi="Calibri"/>
-          <w:sz w:val="19"/>
-          <w:szCs w:val="19"/>
-        </w:rPr>
-        <w:t xml:space="preserve">Built an offline evaluation framework scoring precision/recall/F1 against hand-labeled ground truth, and deployed a local quantized LLM (Qwen2.5 via llama.cpp) with a rules-based fallback for resilience.</w:t>
-      </w:r>
-    </w:p>
-    <w:p>
-      <w:pPr>
-        <w:spacing w:after="30"/>
-        <w:ind w:left="360"/>
-      </w:pPr>
-      <w:hyperlink w:history="1" r:id="rId-awkou8d_y_qqydwrdei6">
+        <w:t xml:space="preserve">  |  </w:t>
+      </w:r>
+      <w:hyperlink w:history="1" r:id="rIda9pmppoebbn4c8a9vbr66">
         <w:r>
           <w:rPr>
             <w:rFonts w:ascii="Calibri" w:cs="Calibri" w:eastAsia="Calibri" w:hAnsi="Calibri"/>
@@ -645,7 +92,7 @@
             <w:szCs w:val="19"/>
             <w:u w:val="single"/>
           </w:rPr>
-          <w:t xml:space="preserve">https://cjportfolio-inky.vercel.app/player.html</w:t>
+          <w:t xml:space="preserve">cjportfolio-inky.vercel.app</w:t>
         </w:r>
       </w:hyperlink>
     </w:p>
@@ -662,9 +109,594 @@
           <w:b/>
           <w:bCs/>
           <w:color w:val="2C3E50"/>
+          <w:sz w:val="22"/>
+          <w:szCs w:val="22"/>
+        </w:rPr>
+        <w:t xml:space="preserve">SUMMARY</w:t>
+      </w:r>
+    </w:p>
+    <w:p>
+      <w:pPr>
+        <w:spacing w:after="20"/>
+      </w:pPr>
+      <w:r>
+        <w:rPr>
+          <w:rFonts w:ascii="Calibri" w:cs="Calibri" w:eastAsia="Calibri" w:hAnsi="Calibri"/>
+          <w:sz w:val="20"/>
+          <w:szCs w:val="20"/>
+        </w:rPr>
+        <w:t xml:space="preserve">Marketing data practitioner with 6 years in marketing and data roles, building conversion tracking, attribution, CRM data, and experimentation systems for consumer and high-value-customer businesses, most recently as Senior Manager, Marketing Insights &amp; CRM Analytics at flyExclusive. Owns the conversion plumbing end to end: Google Tag Manager, Meta Pixel and CAPI, Google Ads conversion tracking, and offline conversion uploads from the CRM. Builds the pipelines in SQL and Python; M.S. in Data Science with hands-on applied-AI experience.</w:t>
+      </w:r>
+    </w:p>
+    <w:p>
+      <w:pPr>
+        <w:pBdr>
+          <w:bottom w:val="single" w:color="2C3E50" w:sz="6" w:space="1"/>
+        </w:pBdr>
+        <w:spacing w:after="60" w:before="140"/>
+      </w:pPr>
+      <w:r>
+        <w:rPr>
+          <w:rFonts w:ascii="Calibri" w:cs="Calibri" w:eastAsia="Calibri" w:hAnsi="Calibri"/>
+          <w:b/>
+          <w:bCs/>
+          <w:color w:val="2C3E50"/>
+          <w:sz w:val="22"/>
+          <w:szCs w:val="22"/>
+        </w:rPr>
+        <w:t xml:space="preserve">TECHNICAL EXPERTISE</w:t>
+      </w:r>
+    </w:p>
+    <w:p>
+      <w:pPr>
+        <w:spacing w:after="30"/>
+      </w:pPr>
+      <w:r>
+        <w:rPr>
+          <w:rFonts w:ascii="Calibri" w:cs="Calibri" w:eastAsia="Calibri" w:hAnsi="Calibri"/>
+          <w:b/>
+          <w:bCs/>
+          <w:sz w:val="20"/>
+          <w:szCs w:val="20"/>
+        </w:rPr>
+        <w:t xml:space="preserve">Growth &amp; Measurement: </w:t>
+      </w:r>
+      <w:r>
+        <w:rPr>
+          <w:rFonts w:ascii="Calibri" w:cs="Calibri" w:eastAsia="Calibri" w:hAnsi="Calibri"/>
+          <w:sz w:val="20"/>
+          <w:szCs w:val="20"/>
+        </w:rPr>
+        <w:t xml:space="preserve">Google Tag Manager, Meta Pixel and Conversions API, Google Ads conversion tracking, offline conversion uploads, multi-touch attribution, UTM and click-ID tracking, event taxonomy design, consent/GPC handling, A/B testing, GA4</w:t>
+      </w:r>
+    </w:p>
+    <w:p>
+      <w:pPr>
+        <w:spacing w:after="30"/>
+      </w:pPr>
+      <w:r>
+        <w:rPr>
+          <w:rFonts w:ascii="Calibri" w:cs="Calibri" w:eastAsia="Calibri" w:hAnsi="Calibri"/>
+          <w:b/>
+          <w:bCs/>
+          <w:sz w:val="20"/>
+          <w:szCs w:val="20"/>
+        </w:rPr>
+        <w:t xml:space="preserve">Data &amp; Engineering: </w:t>
+      </w:r>
+      <w:r>
+        <w:rPr>
+          <w:rFonts w:ascii="Calibri" w:cs="Calibri" w:eastAsia="Calibri" w:hAnsi="Calibri"/>
+          <w:sz w:val="20"/>
+          <w:szCs w:val="20"/>
+        </w:rPr>
+        <w:t xml:space="preserve">SQL (window functions), Python, Postgres, Databricks, REST APIs, data pipelines, CRM/CDP architecture, Master Data Management, HubSpot, Iterable</w:t>
+      </w:r>
+    </w:p>
+    <w:p>
+      <w:pPr>
+        <w:spacing w:after="30"/>
+      </w:pPr>
+      <w:r>
+        <w:rPr>
+          <w:rFonts w:ascii="Calibri" w:cs="Calibri" w:eastAsia="Calibri" w:hAnsi="Calibri"/>
+          <w:b/>
+          <w:bCs/>
+          <w:sz w:val="20"/>
+          <w:szCs w:val="20"/>
+        </w:rPr>
+        <w:t xml:space="preserve">Analytics &amp; AI: </w:t>
+      </w:r>
+      <w:r>
+        <w:rPr>
+          <w:rFonts w:ascii="Calibri" w:cs="Calibri" w:eastAsia="Calibri" w:hAnsi="Calibri"/>
+          <w:sz w:val="20"/>
+          <w:szCs w:val="20"/>
+        </w:rPr>
+        <w:t xml:space="preserve">Tableau, Power BI, LLM pipelines, scikit-learn, XGBoost, AI-assisted development (Claude Code)</w:t>
+      </w:r>
+    </w:p>
+    <w:p>
+      <w:pPr>
+        <w:pBdr>
+          <w:bottom w:val="single" w:color="2C3E50" w:sz="6" w:space="1"/>
+        </w:pBdr>
+        <w:spacing w:after="60" w:before="140"/>
+      </w:pPr>
+      <w:r>
+        <w:rPr>
+          <w:rFonts w:ascii="Calibri" w:cs="Calibri" w:eastAsia="Calibri" w:hAnsi="Calibri"/>
+          <w:b/>
+          <w:bCs/>
+          <w:color w:val="2C3E50"/>
+          <w:sz w:val="22"/>
+          <w:szCs w:val="22"/>
+        </w:rPr>
+        <w:t xml:space="preserve">PROFESSIONAL EXPERIENCE</w:t>
+      </w:r>
+    </w:p>
+    <w:p>
+      <w:pPr>
+        <w:tabs>
+          <w:tab w:val="right" w:pos="10800"/>
+        </w:tabs>
+        <w:spacing w:after="30" w:before="80"/>
+      </w:pPr>
+      <w:r>
+        <w:rPr>
+          <w:rFonts w:ascii="Calibri" w:cs="Calibri" w:eastAsia="Calibri" w:hAnsi="Calibri"/>
+          <w:b/>
+          <w:bCs/>
           <w:sz w:val="21"/>
           <w:szCs w:val="21"/>
         </w:rPr>
+        <w:t xml:space="preserve">flyExclusive, Raleigh, NC</w:t>
+      </w:r>
+      <w:r>
+        <w:rPr>
+          <w:rFonts w:ascii="Calibri" w:cs="Calibri" w:eastAsia="Calibri" w:hAnsi="Calibri"/>
+          <w:i/>
+          <w:iCs/>
+          <w:color w:val="2C3E50"/>
+          <w:sz w:val="21"/>
+          <w:szCs w:val="21"/>
+        </w:rPr>
+        <w:t xml:space="preserve">   Senior Manager, Marketing Insights &amp; CRM Analytics</w:t>
+      </w:r>
+      <w:r>
+        <w:rPr>
+          <w:rFonts w:ascii="Calibri" w:cs="Calibri" w:eastAsia="Calibri" w:hAnsi="Calibri"/>
+          <w:i/>
+          <w:iCs/>
+          <w:color w:val="2C3E50"/>
+          <w:sz w:val="21"/>
+          <w:szCs w:val="21"/>
+        </w:rPr>
+        <w:t xml:space="preserve">	Nov 2025 – Present</w:t>
+      </w:r>
+    </w:p>
+    <w:p>
+      <w:pPr>
+        <w:pStyle w:val="ListParagraph"/>
+        <w:numPr>
+          <w:ilvl w:val="0"/>
+          <w:numId w:val="2"/>
+        </w:numPr>
+        <w:spacing w:after="30"/>
+      </w:pPr>
+      <w:r>
+        <w:rPr>
+          <w:rFonts w:ascii="Calibri" w:cs="Calibri" w:eastAsia="Calibri" w:hAnsi="Calibri"/>
+          <w:sz w:val="20"/>
+          <w:szCs w:val="20"/>
+        </w:rPr>
+        <w:t xml:space="preserve">Implemented conversion tracking for the new company website: Google Tag Manager, Meta Pixel and Conversions API, and Google Ads conversion tracking.</w:t>
+      </w:r>
+    </w:p>
+    <w:p>
+      <w:pPr>
+        <w:pStyle w:val="ListParagraph"/>
+        <w:numPr>
+          <w:ilvl w:val="0"/>
+          <w:numId w:val="2"/>
+        </w:numPr>
+        <w:spacing w:after="30"/>
+      </w:pPr>
+      <w:r>
+        <w:rPr>
+          <w:rFonts w:ascii="Calibri" w:cs="Calibri" w:eastAsia="Calibri" w:hAnsi="Calibri"/>
+          <w:sz w:val="20"/>
+          <w:szCs w:val="20"/>
+        </w:rPr>
+        <w:t xml:space="preserve">Set up offline conversion uploads that send downstream CRM outcomes back to ad platforms, so campaigns optimize on qualified leads and sales instead of form fills.</w:t>
+      </w:r>
+    </w:p>
+    <w:p>
+      <w:pPr>
+        <w:pStyle w:val="ListParagraph"/>
+        <w:numPr>
+          <w:ilvl w:val="0"/>
+          <w:numId w:val="2"/>
+        </w:numPr>
+        <w:spacing w:after="30"/>
+      </w:pPr>
+      <w:r>
+        <w:rPr>
+          <w:rFonts w:ascii="Calibri" w:cs="Calibri" w:eastAsia="Calibri" w:hAnsi="Calibri"/>
+          <w:sz w:val="20"/>
+          <w:szCs w:val="20"/>
+        </w:rPr>
+        <w:t xml:space="preserve">Redesigned the performance dashboards and attribution framework connecting marketing activity to acquisition, retention, and high-value segments.</w:t>
+      </w:r>
+    </w:p>
+    <w:p>
+      <w:pPr>
+        <w:pStyle w:val="ListParagraph"/>
+        <w:numPr>
+          <w:ilvl w:val="0"/>
+          <w:numId w:val="2"/>
+        </w:numPr>
+        <w:spacing w:after="30"/>
+      </w:pPr>
+      <w:r>
+        <w:rPr>
+          <w:rFonts w:ascii="Calibri" w:cs="Calibri" w:eastAsia="Calibri" w:hAnsi="Calibri"/>
+          <w:sz w:val="20"/>
+          <w:szCs w:val="20"/>
+        </w:rPr>
+        <w:t xml:space="preserve">Led a CRM systems transformation: HubSpot governance, scalable data architecture, deduplication workflows, and Master Data Management.</w:t>
+      </w:r>
+    </w:p>
+    <w:p>
+      <w:pPr>
+        <w:pStyle w:val="ListParagraph"/>
+        <w:numPr>
+          <w:ilvl w:val="0"/>
+          <w:numId w:val="2"/>
+        </w:numPr>
+        <w:spacing w:after="30"/>
+      </w:pPr>
+      <w:r>
+        <w:rPr>
+          <w:rFonts w:ascii="Calibri" w:cs="Calibri" w:eastAsia="Calibri" w:hAnsi="Calibri"/>
+          <w:sz w:val="20"/>
+          <w:szCs w:val="20"/>
+        </w:rPr>
+        <w:t xml:space="preserve">Built an autonomous enrichment pipeline connecting LLM APIs to the CRM database, powering a lead-scoring model that prioritizes high-value accounts.</w:t>
+      </w:r>
+    </w:p>
+    <w:p>
+      <w:pPr>
+        <w:tabs>
+          <w:tab w:val="right" w:pos="10800"/>
+        </w:tabs>
+        <w:spacing w:after="30" w:before="80"/>
+      </w:pPr>
+      <w:r>
+        <w:rPr>
+          <w:rFonts w:ascii="Calibri" w:cs="Calibri" w:eastAsia="Calibri" w:hAnsi="Calibri"/>
+          <w:b/>
+          <w:bCs/>
+          <w:sz w:val="21"/>
+          <w:szCs w:val="21"/>
+        </w:rPr>
+        <w:t xml:space="preserve">TRANZACT, Raleigh, NC</w:t>
+      </w:r>
+      <w:r>
+        <w:rPr>
+          <w:rFonts w:ascii="Calibri" w:cs="Calibri" w:eastAsia="Calibri" w:hAnsi="Calibri"/>
+          <w:i/>
+          <w:iCs/>
+          <w:color w:val="2C3E50"/>
+          <w:sz w:val="21"/>
+          <w:szCs w:val="21"/>
+        </w:rPr>
+        <w:t xml:space="preserve">   Sr. Data Analyst, CRM</w:t>
+      </w:r>
+      <w:r>
+        <w:rPr>
+          <w:rFonts w:ascii="Calibri" w:cs="Calibri" w:eastAsia="Calibri" w:hAnsi="Calibri"/>
+          <w:i/>
+          <w:iCs/>
+          <w:color w:val="2C3E50"/>
+          <w:sz w:val="21"/>
+          <w:szCs w:val="21"/>
+        </w:rPr>
+        <w:t xml:space="preserve">	May 2022 – Nov 2025</w:t>
+      </w:r>
+    </w:p>
+    <w:p>
+      <w:pPr>
+        <w:pStyle w:val="ListParagraph"/>
+        <w:numPr>
+          <w:ilvl w:val="0"/>
+          <w:numId w:val="2"/>
+        </w:numPr>
+        <w:spacing w:after="30"/>
+      </w:pPr>
+      <w:r>
+        <w:rPr>
+          <w:rFonts w:ascii="Calibri" w:cs="Calibri" w:eastAsia="Calibri" w:hAnsi="Calibri"/>
+          <w:sz w:val="20"/>
+          <w:szCs w:val="20"/>
+        </w:rPr>
+        <w:t xml:space="preserve">Ran multi-touch attribution modeling and partnered with commercial and finance leadership on attribution, sales performance, and forecasting.</w:t>
+      </w:r>
+    </w:p>
+    <w:p>
+      <w:pPr>
+        <w:pStyle w:val="ListParagraph"/>
+        <w:numPr>
+          <w:ilvl w:val="0"/>
+          <w:numId w:val="2"/>
+        </w:numPr>
+        <w:spacing w:after="30"/>
+      </w:pPr>
+      <w:r>
+        <w:rPr>
+          <w:rFonts w:ascii="Calibri" w:cs="Calibri" w:eastAsia="Calibri" w:hAnsi="Calibri"/>
+          <w:sz w:val="20"/>
+          <w:szCs w:val="20"/>
+        </w:rPr>
+        <w:t xml:space="preserve">Built CRM/ESP integrations (SQL, JSON REST APIs) syncing behavioral data into Iterable for 10+ lifecycle campaigns.</w:t>
+      </w:r>
+    </w:p>
+    <w:p>
+      <w:pPr>
+        <w:pStyle w:val="ListParagraph"/>
+        <w:numPr>
+          <w:ilvl w:val="0"/>
+          <w:numId w:val="2"/>
+        </w:numPr>
+        <w:spacing w:after="30"/>
+      </w:pPr>
+      <w:r>
+        <w:rPr>
+          <w:rFonts w:ascii="Calibri" w:cs="Calibri" w:eastAsia="Calibri" w:hAnsi="Calibri"/>
+          <w:sz w:val="20"/>
+          <w:szCs w:val="20"/>
+        </w:rPr>
+        <w:t xml:space="preserve">Ran a structured A/B testing program: 50% win rate, 30% CTR improvement.</w:t>
+      </w:r>
+    </w:p>
+    <w:p>
+      <w:pPr>
+        <w:tabs>
+          <w:tab w:val="right" w:pos="10800"/>
+        </w:tabs>
+        <w:spacing w:after="30" w:before="80"/>
+      </w:pPr>
+      <w:r>
+        <w:rPr>
+          <w:rFonts w:ascii="Calibri" w:cs="Calibri" w:eastAsia="Calibri" w:hAnsi="Calibri"/>
+          <w:b/>
+          <w:bCs/>
+          <w:sz w:val="21"/>
+          <w:szCs w:val="21"/>
+        </w:rPr>
+        <w:t xml:space="preserve">American Kennel Club, Raleigh, NC</w:t>
+      </w:r>
+      <w:r>
+        <w:rPr>
+          <w:rFonts w:ascii="Calibri" w:cs="Calibri" w:eastAsia="Calibri" w:hAnsi="Calibri"/>
+          <w:i/>
+          <w:iCs/>
+          <w:color w:val="2C3E50"/>
+          <w:sz w:val="21"/>
+          <w:szCs w:val="21"/>
+        </w:rPr>
+        <w:t xml:space="preserve">   Email Marketing Associate</w:t>
+      </w:r>
+      <w:r>
+        <w:rPr>
+          <w:rFonts w:ascii="Calibri" w:cs="Calibri" w:eastAsia="Calibri" w:hAnsi="Calibri"/>
+          <w:i/>
+          <w:iCs/>
+          <w:color w:val="2C3E50"/>
+          <w:sz w:val="21"/>
+          <w:szCs w:val="21"/>
+        </w:rPr>
+        <w:t xml:space="preserve">	Apr 2021 – May 2022</w:t>
+      </w:r>
+    </w:p>
+    <w:p>
+      <w:pPr>
+        <w:pStyle w:val="ListParagraph"/>
+        <w:numPr>
+          <w:ilvl w:val="0"/>
+          <w:numId w:val="2"/>
+        </w:numPr>
+        <w:spacing w:after="30"/>
+      </w:pPr>
+      <w:r>
+        <w:rPr>
+          <w:rFonts w:ascii="Calibri" w:cs="Calibri" w:eastAsia="Calibri" w:hAnsi="Calibri"/>
+          <w:sz w:val="20"/>
+          <w:szCs w:val="20"/>
+        </w:rPr>
+        <w:t xml:space="preserve">Built Tableau-driven audience insights to optimize email program performance.</w:t>
+      </w:r>
+    </w:p>
+    <w:p>
+      <w:pPr>
+        <w:pStyle w:val="ListParagraph"/>
+        <w:numPr>
+          <w:ilvl w:val="0"/>
+          <w:numId w:val="2"/>
+        </w:numPr>
+        <w:spacing w:after="30"/>
+      </w:pPr>
+      <w:r>
+        <w:rPr>
+          <w:rFonts w:ascii="Calibri" w:cs="Calibri" w:eastAsia="Calibri" w:hAnsi="Calibri"/>
+          <w:sz w:val="20"/>
+          <w:szCs w:val="20"/>
+        </w:rPr>
+        <w:t xml:space="preserve">Automated customer journeys with dynamic, segment-driven email content.</w:t>
+      </w:r>
+    </w:p>
+    <w:p>
+      <w:pPr>
+        <w:tabs>
+          <w:tab w:val="right" w:pos="10800"/>
+        </w:tabs>
+        <w:spacing w:after="30" w:before="80"/>
+      </w:pPr>
+      <w:r>
+        <w:rPr>
+          <w:rFonts w:ascii="Calibri" w:cs="Calibri" w:eastAsia="Calibri" w:hAnsi="Calibri"/>
+          <w:b/>
+          <w:bCs/>
+          <w:sz w:val="21"/>
+          <w:szCs w:val="21"/>
+        </w:rPr>
+        <w:t xml:space="preserve">OnPoint, Raleigh, NC</w:t>
+      </w:r>
+      <w:r>
+        <w:rPr>
+          <w:rFonts w:ascii="Calibri" w:cs="Calibri" w:eastAsia="Calibri" w:hAnsi="Calibri"/>
+          <w:i/>
+          <w:iCs/>
+          <w:color w:val="2C3E50"/>
+          <w:sz w:val="21"/>
+          <w:szCs w:val="21"/>
+        </w:rPr>
+        <w:t xml:space="preserve">   Marketing Manager</w:t>
+      </w:r>
+      <w:r>
+        <w:rPr>
+          <w:rFonts w:ascii="Calibri" w:cs="Calibri" w:eastAsia="Calibri" w:hAnsi="Calibri"/>
+          <w:i/>
+          <w:iCs/>
+          <w:color w:val="2C3E50"/>
+          <w:sz w:val="21"/>
+          <w:szCs w:val="21"/>
+        </w:rPr>
+        <w:t xml:space="preserve">	Oct 2020 – Apr 2021</w:t>
+      </w:r>
+    </w:p>
+    <w:p>
+      <w:pPr>
+        <w:pStyle w:val="ListParagraph"/>
+        <w:numPr>
+          <w:ilvl w:val="0"/>
+          <w:numId w:val="2"/>
+        </w:numPr>
+        <w:spacing w:after="30"/>
+      </w:pPr>
+      <w:r>
+        <w:rPr>
+          <w:rFonts w:ascii="Calibri" w:cs="Calibri" w:eastAsia="Calibri" w:hAnsi="Calibri"/>
+          <w:sz w:val="20"/>
+          <w:szCs w:val="20"/>
+        </w:rPr>
+        <w:t xml:space="preserve">Led lifecycle strategy and audience targeting across email and paid social, aligning C-suite stakeholders on data-driven marketing execution.</w:t>
+      </w:r>
+    </w:p>
+    <w:p>
+      <w:pPr>
+        <w:pBdr>
+          <w:bottom w:val="single" w:color="2C3E50" w:sz="6" w:space="1"/>
+        </w:pBdr>
+        <w:spacing w:after="60" w:before="140"/>
+      </w:pPr>
+      <w:r>
+        <w:rPr>
+          <w:rFonts w:ascii="Calibri" w:cs="Calibri" w:eastAsia="Calibri" w:hAnsi="Calibri"/>
+          <w:b/>
+          <w:bCs/>
+          <w:color w:val="2C3E50"/>
+          <w:sz w:val="22"/>
+          <w:szCs w:val="22"/>
+        </w:rPr>
+        <w:t xml:space="preserve">FEATURED PROJECTS</w:t>
+      </w:r>
+    </w:p>
+    <w:p>
+      <w:pPr>
+        <w:spacing w:after="30" w:before="60"/>
+      </w:pPr>
+      <w:r>
+        <w:rPr>
+          <w:rFonts w:ascii="Calibri" w:cs="Calibri" w:eastAsia="Calibri" w:hAnsi="Calibri"/>
+          <w:b/>
+          <w:bCs/>
+          <w:sz w:val="20"/>
+          <w:szCs w:val="20"/>
+        </w:rPr>
+        <w:t xml:space="preserve">Attribution Lab, First-Party Growth Tracking (portfolio site)</w:t>
+      </w:r>
+    </w:p>
+    <w:p>
+      <w:pPr>
+        <w:pStyle w:val="ListParagraph"/>
+        <w:numPr>
+          <w:ilvl w:val="0"/>
+          <w:numId w:val="2"/>
+        </w:numPr>
+        <w:spacing w:after="30"/>
+      </w:pPr>
+      <w:r>
+        <w:rPr>
+          <w:rFonts w:ascii="Calibri" w:cs="Calibri" w:eastAsia="Calibri" w:hAnsi="Calibri"/>
+          <w:sz w:val="20"/>
+          <w:szCs w:val="20"/>
+        </w:rPr>
+        <w:t xml:space="preserve">Built first-party tracking end to end: UTM and ad click-ID capture (gclid, gbraid, wbraid, fbclid, ttclid, li_fat_id), an event taxonomy enforced at a server-side ingestion endpoint, and event_id dedup into Postgres (Neon).</w:t>
+      </w:r>
+    </w:p>
+    <w:p>
+      <w:pPr>
+        <w:pStyle w:val="ListParagraph"/>
+        <w:numPr>
+          <w:ilvl w:val="0"/>
+          <w:numId w:val="2"/>
+        </w:numPr>
+        <w:spacing w:after="30"/>
+      </w:pPr>
+      <w:r>
+        <w:rPr>
+          <w:rFonts w:ascii="Calibri" w:cs="Calibri" w:eastAsia="Calibri" w:hAnsi="Calibri"/>
+          <w:sz w:val="20"/>
+          <w:szCs w:val="20"/>
+        </w:rPr>
+        <w:t xml:space="preserve">Wrote first-touch, last-touch, and linear attribution in SQL (window functions, 30-day lookback), data-quality checks, and consent-gated offline-conversion payloads for Google Ads, Meta CAPI, TikTok, and LinkedIn; honors Global Privacy Control.</w:t>
+      </w:r>
+    </w:p>
+    <w:p>
+      <w:pPr>
+        <w:spacing w:after="30"/>
+        <w:ind w:left="360"/>
+      </w:pPr>
+      <w:hyperlink w:history="1" w:anchor="/project/attribution" r:id="rIdqt-yrbf8ugz9uq1wocwz5">
+        <w:r>
+          <w:rPr>
+            <w:rFonts w:ascii="Calibri" w:cs="Calibri" w:eastAsia="Calibri" w:hAnsi="Calibri"/>
+            <w:color w:val="1F5FAD"/>
+            <w:sz w:val="20"/>
+            <w:szCs w:val="20"/>
+            <w:u w:val="single"/>
+          </w:rPr>
+          <w:t xml:space="preserve">https://cjportfolio-inky.vercel.app/#/project/attribution</w:t>
+        </w:r>
+      </w:hyperlink>
+    </w:p>
+    <w:p>
+      <w:pPr>
+        <w:pBdr>
+          <w:bottom w:val="single" w:color="2C3E50" w:sz="6" w:space="1"/>
+        </w:pBdr>
+        <w:spacing w:after="60" w:before="140"/>
+      </w:pPr>
+      <w:r>
+        <w:rPr>
+          <w:rFonts w:ascii="Calibri" w:cs="Calibri" w:eastAsia="Calibri" w:hAnsi="Calibri"/>
+          <w:b/>
+          <w:bCs/>
+          <w:color w:val="2C3E50"/>
+          <w:sz w:val="22"/>
+          <w:szCs w:val="22"/>
+        </w:rPr>
         <w:t xml:space="preserve">EDUCATION</w:t>
       </w:r>
     </w:p>
@@ -677,16 +709,16 @@
           <w:rFonts w:ascii="Calibri" w:cs="Calibri" w:eastAsia="Calibri" w:hAnsi="Calibri"/>
           <w:b/>
           <w:bCs/>
-          <w:sz w:val="19"/>
-          <w:szCs w:val="19"/>
+          <w:sz w:val="20"/>
+          <w:szCs w:val="20"/>
         </w:rPr>
         <w:t xml:space="preserve">Eastern University</w:t>
       </w:r>
       <w:r>
         <w:rPr>
           <w:rFonts w:ascii="Calibri" w:cs="Calibri" w:eastAsia="Calibri" w:hAnsi="Calibri"/>
-          <w:sz w:val="19"/>
-          <w:szCs w:val="19"/>
+          <w:sz w:val="20"/>
+          <w:szCs w:val="20"/>
         </w:rPr>
         <w:t xml:space="preserve">  –  M.S. in Data Science (Dec 2025)</w:t>
       </w:r>
@@ -699,8 +731,8 @@
       <w:r>
         <w:rPr>
           <w:rFonts w:ascii="Calibri" w:cs="Calibri" w:eastAsia="Calibri" w:hAnsi="Calibri"/>
-          <w:sz w:val="19"/>
-          <w:szCs w:val="19"/>
+          <w:sz w:val="20"/>
+          <w:szCs w:val="20"/>
         </w:rPr>
         <w:t xml:space="preserve">Classes in Machine Learning, Cloud Computing and Data Analysis</w:t>
       </w:r>
@@ -714,16 +746,16 @@
           <w:rFonts w:ascii="Calibri" w:cs="Calibri" w:eastAsia="Calibri" w:hAnsi="Calibri"/>
           <w:b/>
           <w:bCs/>
-          <w:sz w:val="19"/>
-          <w:szCs w:val="19"/>
+          <w:sz w:val="20"/>
+          <w:szCs w:val="20"/>
         </w:rPr>
         <w:t xml:space="preserve">North Carolina State University</w:t>
       </w:r>
       <w:r>
         <w:rPr>
           <w:rFonts w:ascii="Calibri" w:cs="Calibri" w:eastAsia="Calibri" w:hAnsi="Calibri"/>
-          <w:sz w:val="19"/>
-          <w:szCs w:val="19"/>
+          <w:sz w:val="20"/>
+          <w:szCs w:val="20"/>
         </w:rPr>
         <w:t xml:space="preserve">  –  B.A. in Psychology (May 2018)</w:t>
       </w:r>
@@ -931,8 +963,8 @@
     <w:rPrDefault>
       <w:rPr>
         <w:rFonts w:ascii="Calibri" w:cs="Calibri" w:eastAsia="Calibri" w:hAnsi="Calibri"/>
-        <w:sz w:val="19"/>
-        <w:szCs w:val="19"/>
+        <w:sz w:val="20"/>
+        <w:szCs w:val="20"/>
       </w:rPr>
     </w:rPrDefault>
     <w:pPrDefault/>
@@ -1089,7 +1121,7 @@
     <w:unhideWhenUsed/>
     <w:pPr>
       <w:spacing w:after="100"/>
-      <w:ind w:left="190"/>
+      <w:ind w:left="200"/>
     </w:pPr>
   </w:style>
   <w:style w:type="paragraph" w:styleId="TOC3">
@@ -1101,7 +1133,7 @@
     <w:unhideWhenUsed/>
     <w:pPr>
       <w:spacing w:after="100"/>
-      <w:ind w:left="380"/>
+      <w:ind w:left="400"/>
     </w:pPr>
   </w:style>
   <w:style w:type="paragraph" w:styleId="TOC4">
@@ -1113,7 +1145,7 @@
     <w:unhideWhenUsed/>
     <w:pPr>
       <w:spacing w:after="100"/>
-      <w:ind w:left="570"/>
+      <w:ind w:left="600"/>
     </w:pPr>
   </w:style>
   <w:style w:type="paragraph" w:styleId="TOC5">
@@ -1125,7 +1157,7 @@
     <w:unhideWhenUsed/>
     <w:pPr>
       <w:spacing w:after="100"/>
-      <w:ind w:left="760"/>
+      <w:ind w:left="800"/>
     </w:pPr>
   </w:style>
   <w:style w:type="paragraph" w:styleId="TOC6">
@@ -1137,7 +1169,7 @@
     <w:unhideWhenUsed/>
     <w:pPr>
       <w:spacing w:after="100"/>
-      <w:ind w:left="950"/>
+      <w:ind w:left="1000"/>
     </w:pPr>
   </w:style>
   <w:style w:type="paragraph" w:styleId="TOC7">
@@ -1149,7 +1181,7 @@
     <w:unhideWhenUsed/>
     <w:pPr>
       <w:spacing w:after="100"/>
-      <w:ind w:left="1140"/>
+      <w:ind w:left="1200"/>
     </w:pPr>
   </w:style>
   <w:style w:type="paragraph" w:styleId="TOC8">
@@ -1161,7 +1193,7 @@
     <w:unhideWhenUsed/>
     <w:pPr>
       <w:spacing w:after="100"/>
-      <w:ind w:left="1330"/>
+      <w:ind w:left="1400"/>
     </w:pPr>
   </w:style>
   <w:style w:type="paragraph" w:styleId="TOC9">
@@ -1173,7 +1205,7 @@
     <w:unhideWhenUsed/>
     <w:pPr>
       <w:spacing w:after="100"/>
-      <w:ind w:left="1520"/>
+      <w:ind w:left="1600"/>
     </w:pPr>
   </w:style>
   <w:style w:type="character" w:styleId="Hyperlink">

</xml_diff>